<commit_message>
Correct agreement scope: plan includes new page additions, not just fixes
Exhibit A now includes new web page additions (3 in first 2 months,
then 1-2/month) built and published directly by Richard, matching what
he's actually offering Joe -- not just improvements to existing thin
pages. Not Included list updated to drop the page-additions exclusion
and keep only blog/case-study/article drafting excluded.

Co-Authored-By: Claude Sonnet 5 <noreply@anthropic.com>
Claude-Session: https://claude.ai/code/session_01VMnSYfECc1oQpoEsieLG4r
</commit_message>
<xml_diff>
--- a/SEO-Clients-Hub/clients/JoeWelchPhotography/Joe-Welch-Photography-Services-Agreement-DRAFT.docx
+++ b/SEO-Clients-Hub/clients/JoeWelchPhotography/Joe-Welch-Photography-Services-Agreement-DRAFT.docx
@@ -1571,7 +1571,7 @@
           <w:sz w:val="20"/>
           <w:szCs w:val="20"/>
         </w:rPr>
-        <w:t xml:space="preserve">Content and SEO improvements to up to three (3) existing thin-content pages in the first two (2) months, then additional pages as needed thereafter, implemented directly by Provider using Client-provided website access. This strengthens existing pages; it does not include building or publishing new pages (see Section C).</w:t>
+        <w:t xml:space="preserve">New web page additions — up to three (3) pages in the first two (2) months, then one to two (1–2) pages per month thereafter — built and published directly by Provider using Client-provided website access. Page topics are selected collaboratively based on SEO opportunity, such as additional service-area landing pages for Client’s priority Fort Lauderdale/Broward market, specialty service pages (e.g., aerial/drone, commercial, hotel/resort), or an FAQ page. Does not include blog-style case studies or long-form articles (see Section C).</w:t>
       </w:r>
     </w:p>
     <w:p>
@@ -1722,7 +1722,7 @@
           <w:sz w:val="20"/>
           <w:szCs w:val="20"/>
         </w:rPr>
-        <w:t xml:space="preserve">Web page additions (new pages built or published by Provider), blog post drafting, competitor research, advanced internal-linking strategy, paid advertising, social-media services, or advanced AI-search/long-term growth strategy.</w:t>
+        <w:t xml:space="preserve">Blog post drafting, case studies, long-form articles, competitor research, advanced internal-linking strategy, paid advertising, social-media services, or advanced AI-search/long-term growth strategy.</w:t>
       </w:r>
     </w:p>
     <w:p>

</xml_diff>

<commit_message>
Incorporate Joe's requested contract edits
- Fix Section D so plan-included page additions don't need a separate
  change order (was contradicting Exhibit A's included-services list)
- Soften page-addition cadence to "up to ... as justified by SEO
  opportunity," explicitly ruling out filler/near-duplicate city pages
- Add client approval before publishing new pages (not required for
  routine fixes to existing pages, which stay direct)
- Replace the flat 12-month non-cancelable term with a day-90
  performance checkpoint: Joe can exit without further payment if
  Richard hasn't delivered core Exhibit A setup work by month 3 (tied
  to delivery, not to SEO results, consistent with Section 6)

Co-Authored-By: Claude Sonnet 5 <noreply@anthropic.com>
Claude-Session: https://claude.ai/code/session_01VMnSYfECc1oQpoEsieLG4r
</commit_message>
<xml_diff>
--- a/SEO-Clients-Hub/clients/JoeWelchPhotography/Joe-Welch-Photography-Services-Agreement-DRAFT.docx
+++ b/SEO-Clients-Hub/clients/JoeWelchPhotography/Joe-Welch-Photography-Services-Agreement-DRAFT.docx
@@ -373,14 +373,14 @@
           <w:sz w:val="20"/>
           <w:szCs w:val="20"/>
         </w:rPr>
-        <w:t xml:space="preserve">2.2 Twelve-Month Commitment. </w:t>
-      </w:r>
-      <w:r>
-        <w:rPr>
-          <w:sz w:val="20"/>
-          <w:szCs w:val="20"/>
-        </w:rPr>
-        <w:t xml:space="preserve">Neither Party may terminate for convenience during the Initial Term. If Client stops the Services or access without Provider’s material breach, Client remains responsible for the unpaid monthly fees through the end of the Initial Term. The Parties agree this payment commitment reflects reserved capacity and agreed pricing and is not a penalty, subject to any non-waivable law.</w:t>
+        <w:t xml:space="preserve">2.2 Twelve-Month Commitment; Day-90 Performance Checkpoint. </w:t>
+      </w:r>
+      <w:r>
+        <w:rPr>
+          <w:sz w:val="20"/>
+          <w:szCs w:val="20"/>
+        </w:rPr>
+        <w:t xml:space="preserve">Neither Party may terminate for convenience during the Initial Term, except as provided in this Section 2.2. If, by the end of the third (3rd) full service month, Provider has not completed the following core Exhibit A deliverables — the brand disambiguation schema, Google Business Profile and Yelp/NAP cleanup, a technical SEO baseline pass, and at least one of the first two included web page additions, each as described in Exhibit A Section B — and Client has provided the access, approvals, and materials reasonably needed for that work under Section 4, Client may terminate this Agreement on written notice without further payment obligation beyond amounts already due. This checkpoint is based on Provider’s completion of the stated deliverables, not on search rankings, traffic, or other results, which Section 6 does not guarantee and which typically take longer than 90 days to materialize. Absent timely notice under this Section 2.2, or if Provider has completed the stated deliverables, Client remains responsible for the unpaid monthly fees through the end of the Initial Term if Client stops the Services or access without Provider’s material breach. The Parties agree this payment commitment reflects reserved capacity and agreed pricing and is not a penalty, subject to any non-waivable law.</w:t>
       </w:r>
     </w:p>
     <w:p>
@@ -1571,7 +1571,7 @@
           <w:sz w:val="20"/>
           <w:szCs w:val="20"/>
         </w:rPr>
-        <w:t xml:space="preserve">New web page additions — up to three (3) pages in the first two (2) months, then one to two (1–2) pages per month thereafter — built and published directly by Provider using Client-provided website access. Page topics are selected collaboratively based on SEO opportunity, such as additional service-area landing pages for Client’s priority Fort Lauderdale/Broward market, specialty service pages (e.g., aerial/drone, commercial, hotel/resort), or an FAQ page. Does not include blog-style case studies or long-form articles (see Section C).</w:t>
+        <w:t xml:space="preserve">New web page additions — up to three (3) pages in the first two (2) months, then up to one to two (1–2) pages per month thereafter as justified by SEO opportunity — built by Provider using Client-provided website access and published only after Client approval per Section D. Pages are added only where genuinely differentiated content and search demand support a separate page; pages are not created merely to reach a monthly count, and geographic-area pages in particular will not be near-duplicates of one another or of Client’s existing service pages. Page topics are selected collaboratively, such as additional service-area landing pages for Client’s priority Fort Lauderdale/Broward market, specialty pages for underserved search intent, or an FAQ page. Pages included under this line item do not require a separate change order under Section 1. Does not include blog-style case studies or long-form articles (see Section C).</w:t>
       </w:r>
     </w:p>
     <w:p>
@@ -1839,7 +1839,24 @@
           <w:sz w:val="20"/>
           <w:szCs w:val="20"/>
         </w:rPr>
-        <w:t xml:space="preserve">New pages, substantial copywriting, material redesigns, and changes in direction require a written change order.</w:t>
+        <w:t xml:space="preserve">The web page additions described in Section B (up to 3 in the first two months, then up to 1–2/month as justified) do not require a separate change order. Pages beyond that pace, substantial copywriting outside Exhibit A, material redesigns, and changes in direction require a written change order.</w:t>
+      </w:r>
+    </w:p>
+    <w:p>
+      <w:pPr>
+        <w:pStyle w:val="ListParagraph"/>
+        <w:numPr>
+          <w:ilvl w:val="0"/>
+          <w:numId w:val="1"/>
+        </w:numPr>
+        <w:spacing w:after="60"/>
+      </w:pPr>
+      <w:r>
+        <w:rPr>
+          <w:sz w:val="20"/>
+          <w:szCs w:val="20"/>
+        </w:rPr>
+        <w:t xml:space="preserve">Before publishing a new page under Section B, Provider will share the page and its content with Client for review. Client will approve or provide feedback within five (5) business days of receipt (consistent with Section 4); if Client does not respond within that window, the page is deemed approved. This approval step applies only to new page additions — routine on-page SEO, technical, schema, and other fixes to Client’s existing pages under Section B remain implemented directly without a separate approval step.</w:t>
       </w:r>
     </w:p>
     <w:p>

</xml_diff>

<commit_message>
Replace performance checkpoint with a straight 90-day referral exception
Richard decided to just grant Joe's original ask: cancellation for any
reason after 90 days on 30 days' notice, no fee, no deliverables
checklist. Framed explicitly in Section 2.2 as an exception to the
standard 12-month term granted because Joe was referred by an existing
client, so it doesn't read as Richard's default policy. Also loosens
the Section 3.1 total-contract-value language to "up to $1,188" to
stay consistent with the new early-exit possibility.

Co-Authored-By: Claude Sonnet 5 <noreply@anthropic.com>
Claude-Session: https://claude.ai/code/session_01VMnSYfECc1oQpoEsieLG4r
</commit_message>
<xml_diff>
--- a/SEO-Clients-Hub/clients/JoeWelchPhotography/Joe-Welch-Photography-Services-Agreement-DRAFT.docx
+++ b/SEO-Clients-Hub/clients/JoeWelchPhotography/Joe-Welch-Photography-Services-Agreement-DRAFT.docx
@@ -373,14 +373,35 @@
           <w:sz w:val="20"/>
           <w:szCs w:val="20"/>
         </w:rPr>
-        <w:t xml:space="preserve">2.2 Twelve-Month Commitment; Day-90 Performance Checkpoint. </w:t>
-      </w:r>
-      <w:r>
-        <w:rPr>
-          <w:sz w:val="20"/>
-          <w:szCs w:val="20"/>
-        </w:rPr>
-        <w:t xml:space="preserve">Neither Party may terminate for convenience during the Initial Term, except as provided in this Section 2.2. If, by the end of the third (3rd) full service month, Provider has not completed the following core Exhibit A deliverables — the brand disambiguation schema, Google Business Profile and Yelp/NAP cleanup, a technical SEO baseline pass, and at least one of the first two included web page additions, each as described in Exhibit A Section B — and Client has provided the access, approvals, and materials reasonably needed for that work under Section 4, Client may terminate this Agreement on written notice without further payment obligation beyond amounts already due. This checkpoint is based on Provider’s completion of the stated deliverables, not on search rankings, traffic, or other results, which Section 6 does not guarantee and which typically take longer than 90 days to materialize. Absent timely notice under this Section 2.2, or if Provider has completed the stated deliverables, Client remains responsible for the unpaid monthly fees through the end of the Initial Term if Client stops the Services or access without Provider’s material breach. The Parties agree this payment commitment reflects reserved capacity and agreed pricing and is not a penalty, subject to any non-waivable law.</w:t>
+        <w:t xml:space="preserve">2.2 Twelve-Month Commitment; Referral Exception. </w:t>
+      </w:r>
+      <w:r>
+        <w:rPr>
+          <w:sz w:val="20"/>
+          <w:szCs w:val="20"/>
+        </w:rPr>
+        <w:t xml:space="preserve">Except as provided in this Section 2.2, neither Party may terminate for convenience during the Initial Term; if Client stops the Services or access without Provider’s material breach, Client remains responsible for the unpaid monthly fees through the end of the Initial Term, and the Parties agree this payment commitment reflects reserved capacity and agreed pricing and is not a penalty, subject to any non-waivable law.</w:t>
+      </w:r>
+    </w:p>
+    <w:p>
+      <w:pPr>
+        <w:spacing w:after="140"/>
+      </w:pPr>
+      <w:r>
+        <w:rPr>
+          <w:b/>
+          <w:bCs/>
+          <w:sz w:val="20"/>
+          <w:szCs w:val="20"/>
+        </w:rPr>
+        <w:t xml:space="preserve">As an exception to Provider’s standard twelve-month commitment, offered because Client was referred by an existing Provider client: </w:t>
+      </w:r>
+      <w:r>
+        <w:rPr>
+          <w:sz w:val="20"/>
+          <w:szCs w:val="20"/>
+        </w:rPr>
+        <w:t xml:space="preserve">Client may terminate this Agreement for any reason after the first ninety (90) days of the Initial Term, upon thirty (30) days’ prior written notice, without further payment obligation beyond amounts due through the notice period. The Parties acknowledge that search rankings, traffic, and other SEO results are not guaranteed (Section 6) and often take longer than 90 days to materialize, and that this exception is granted independent of any such results.</w:t>
       </w:r>
     </w:p>
     <w:p>
@@ -458,7 +479,7 @@
           <w:sz w:val="20"/>
           <w:szCs w:val="20"/>
         </w:rPr>
-        <w:t xml:space="preserve">Client will pay $99.00 per month for twelve (12) months, for a total contract value of $1,188.00, plus applicable taxes.</w:t>
+        <w:t xml:space="preserve">Client will pay $99.00 per month, for a total contract value of up to $1,188.00 over the twelve (12) month Initial Term, plus applicable taxes, subject to Section 2.2.</w:t>
       </w:r>
     </w:p>
     <w:p>

</xml_diff>